<commit_message>
Se comenzo con el diseño en Kicad y agregado de simbolos y huellas del proyecto
</commit_message>
<xml_diff>
--- a/Salus IV/Mejoras_Salus_IV.docx
+++ b/Salus IV/Mejoras_Salus_IV.docx
@@ -573,6 +573,13 @@
         </w:rPr>
         <w:t xml:space="preserve"> (Ya preguntado – 23/1/2026).</w:t>
       </w:r>
+      <w:r>
+        <w:rPr>
+          <w:highlight w:val="darkYellow"/>
+          <w:lang w:val="es-ES"/>
+        </w:rPr>
+        <w:t xml:space="preserve"> Leo quiere que lo incorporemos en esta versión de la placa, ¿lo hacemos?</w:t>
+      </w:r>
     </w:p>
     <w:p>
       <w:pPr>
@@ -616,6 +623,29 @@
         </w:rPr>
         <w:t xml:space="preserve"> (Ya preguntado – 23/1/2026).</w:t>
       </w:r>
+      <w:r>
+        <w:rPr>
+          <w:highlight w:val="darkYellow"/>
+          <w:lang w:val="es-ES"/>
+        </w:rPr>
+        <w:t xml:space="preserve"> Leo quiere que lo diseñe para esta </w:t>
+      </w:r>
+      <w:proofErr w:type="gramStart"/>
+      <w:r>
+        <w:rPr>
+          <w:highlight w:val="darkYellow"/>
+          <w:lang w:val="es-ES"/>
+        </w:rPr>
+        <w:t>versión</w:t>
+      </w:r>
+      <w:proofErr w:type="gramEnd"/>
+      <w:r>
+        <w:rPr>
+          <w:highlight w:val="darkYellow"/>
+          <w:lang w:val="es-ES"/>
+        </w:rPr>
+        <w:t xml:space="preserve"> pero en una placa distinta.</w:t>
+      </w:r>
     </w:p>
     <w:p>
       <w:pPr>
@@ -896,6 +926,7 @@
           <w:highlight w:val="yellow"/>
           <w:lang w:val="es-ES"/>
         </w:rPr>
+        <w:lastRenderedPageBreak/>
         <w:t>Reemplazar componentes por SMD.</w:t>
       </w:r>
       <w:r>
@@ -1377,14 +1408,8 @@
         <w:rPr>
           <w:lang w:val="es-ES"/>
         </w:rPr>
-        <w:t xml:space="preserve">En mi libreta hice algunas anotaciones importantes (20/1/2026). Lo que se me ocurre es que cambiemos algunas cosas que estamos usando que no requieren velocidad de </w:t>
-      </w:r>
-      <w:r>
-        <w:rPr>
-          <w:lang w:val="es-ES"/>
-        </w:rPr>
         <w:lastRenderedPageBreak/>
-        <w:t>transmisión, PWM o sea solo un “ON” (</w:t>
+        <w:t>En mi libreta hice algunas anotaciones importantes (20/1/2026). Lo que se me ocurre es que cambiemos algunas cosas que estamos usando que no requieren velocidad de transmisión, PWM o sea solo un “ON” (</w:t>
       </w:r>
       <w:proofErr w:type="spellStart"/>
       <w:r>
@@ -4184,7 +4209,19 @@
           <w:rPr>
             <w:rStyle w:val="Hipervnculo"/>
           </w:rPr>
-          <w:t>ACA</w:t>
+          <w:t>A</w:t>
+        </w:r>
+        <w:r>
+          <w:rPr>
+            <w:rStyle w:val="Hipervnculo"/>
+          </w:rPr>
+          <w:t>C</w:t>
+        </w:r>
+        <w:r>
+          <w:rPr>
+            <w:rStyle w:val="Hipervnculo"/>
+          </w:rPr>
+          <w:t>A</w:t>
         </w:r>
       </w:hyperlink>
     </w:p>
@@ -4211,6 +4248,8 @@
         </w:numPr>
         <w:rPr>
           <w:rStyle w:val="nfasis"/>
+          <w:b/>
+          <w:bCs/>
         </w:rPr>
       </w:pPr>
       <w:r>
@@ -4261,7 +4300,25 @@
             <w:i/>
             <w:iCs/>
           </w:rPr>
-          <w:t>RTT12122JTP</w:t>
+          <w:t>RTT1</w:t>
+        </w:r>
+        <w:r>
+          <w:rPr>
+            <w:rStyle w:val="Hipervnculo"/>
+            <w:rFonts w:hint="eastAsia"/>
+            <w:i/>
+            <w:iCs/>
+          </w:rPr>
+          <w:t>2</w:t>
+        </w:r>
+        <w:r>
+          <w:rPr>
+            <w:rStyle w:val="Hipervnculo"/>
+            <w:rFonts w:hint="eastAsia"/>
+            <w:i/>
+            <w:iCs/>
+          </w:rPr>
+          <w:t>122JTP</w:t>
         </w:r>
       </w:hyperlink>
       <w:r>
@@ -4271,6 +4328,23 @@
         </w:rPr>
         <w:t xml:space="preserve"> porque el otro solo soporta 100mW y en el caso que 24V pasen derecho se nos quema, este lo tolera (es de 500mW).</w:t>
       </w:r>
+      <w:r>
+        <w:rPr>
+          <w:i/>
+          <w:iCs/>
+        </w:rPr>
+        <w:t xml:space="preserve"> Lo cambie por este: </w:t>
+      </w:r>
+      <w:r>
+        <w:rPr>
+          <w:rFonts w:hint="eastAsia"/>
+          <w:b/>
+          <w:bCs/>
+          <w:i/>
+          <w:iCs/>
+        </w:rPr>
+        <w:t>1206W4J0102T5E</w:t>
+      </w:r>
     </w:p>
     <w:p>
       <w:pPr>
@@ -4281,6 +4355,8 @@
         </w:numPr>
         <w:rPr>
           <w:rStyle w:val="nfasis"/>
+          <w:b/>
+          <w:bCs/>
         </w:rPr>
       </w:pPr>
       <w:r>
@@ -4328,7 +4404,19 @@
           <w:rPr>
             <w:rStyle w:val="Hipervnculo"/>
           </w:rPr>
-          <w:t>RCT0647KFLF</w:t>
+          <w:t>RCT064</w:t>
+        </w:r>
+        <w:r>
+          <w:rPr>
+            <w:rStyle w:val="Hipervnculo"/>
+          </w:rPr>
+          <w:t>7</w:t>
+        </w:r>
+        <w:r>
+          <w:rPr>
+            <w:rStyle w:val="Hipervnculo"/>
+          </w:rPr>
+          <w:t>KFLF</w:t>
         </w:r>
       </w:hyperlink>
       <w:r>
@@ -4337,6 +4425,22 @@
         </w:rPr>
         <w:t xml:space="preserve"> es de 250mW.</w:t>
       </w:r>
+      <w:r>
+        <w:rPr>
+          <w:rStyle w:val="nfasis"/>
+        </w:rPr>
+        <w:t xml:space="preserve"> Lo cambie por este: </w:t>
+      </w:r>
+      <w:r>
+        <w:rPr>
+          <w:rFonts w:hint="eastAsia"/>
+          <w:b/>
+          <w:bCs/>
+          <w:i/>
+          <w:iCs/>
+        </w:rPr>
+        <w:t>1206W4J0473T5E</w:t>
+      </w:r>
     </w:p>
     <w:p>
       <w:pPr>
@@ -4346,6 +4450,8 @@
           <w:numId w:val="17"/>
         </w:numPr>
         <w:rPr>
+          <w:b/>
+          <w:bCs/>
           <w:i/>
           <w:iCs/>
         </w:rPr>
@@ -4374,6 +4480,43 @@
         </w:rPr>
         <w:t>.</w:t>
       </w:r>
+      <w:r>
+        <w:rPr>
+          <w:i/>
+          <w:iCs/>
+        </w:rPr>
+        <w:t xml:space="preserve"> Lo cambie por este: </w:t>
+      </w:r>
+      <w:r>
+        <w:rPr>
+          <w:rFonts w:hint="eastAsia"/>
+          <w:b/>
+          <w:bCs/>
+          <w:i/>
+          <w:iCs/>
+        </w:rPr>
+        <w:t>1206W4J0682T5E</w:t>
+      </w:r>
+    </w:p>
+    <w:p>
+      <w:pPr>
+        <w:pStyle w:val="Prrafodelista"/>
+        <w:numPr>
+          <w:ilvl w:val="0"/>
+          <w:numId w:val="17"/>
+        </w:numPr>
+        <w:rPr>
+          <w:i/>
+          <w:iCs/>
+        </w:rPr>
+      </w:pPr>
+      <w:r>
+        <w:rPr>
+          <w:i/>
+          <w:iCs/>
+        </w:rPr>
+        <w:t>El cambio al ultimo es para mantener un mismo encapsulado. Todos soportan 250mW</w:t>
+      </w:r>
     </w:p>
     <w:p>
       <w:pPr>
@@ -4626,10 +4769,19 @@
       </w:r>
       <w:hyperlink r:id="rId38" w:history="1">
         <w:r>
+          <w:t xml:space="preserve"> </w:t>
+        </w:r>
+        <w:r>
           <w:rPr>
             <w:rStyle w:val="Hipervnculo"/>
           </w:rPr>
-          <w:t>IRFR5305TRLPBF.</w:t>
+          <w:t>IRFR5305</w:t>
+        </w:r>
+        <w:r>
+          <w:rPr>
+            <w:rStyle w:val="Hipervnculo"/>
+          </w:rPr>
+          <w:t>TRLPBF.</w:t>
         </w:r>
       </w:hyperlink>
     </w:p>
@@ -4940,6 +5092,7 @@
         <w:rPr>
           <w:rStyle w:val="nfasis"/>
         </w:rPr>
+        <w:lastRenderedPageBreak/>
         <w:t>TVS:</w:t>
       </w:r>
     </w:p>
@@ -4958,7 +5111,6 @@
         <w:rPr>
           <w:rStyle w:val="nfasis"/>
         </w:rPr>
-        <w:lastRenderedPageBreak/>
         <w:t xml:space="preserve">Usamos el mismo </w:t>
       </w:r>
       <w:hyperlink r:id="rId41" w:history="1">
@@ -5057,7 +5209,19 @@
           <w:rPr>
             <w:rStyle w:val="Hipervnculo"/>
           </w:rPr>
-          <w:t>alimentación</w:t>
+          <w:t>alimen</w:t>
+        </w:r>
+        <w:r>
+          <w:rPr>
+            <w:rStyle w:val="Hipervnculo"/>
+          </w:rPr>
+          <w:t>t</w:t>
+        </w:r>
+        <w:r>
+          <w:rPr>
+            <w:rStyle w:val="Hipervnculo"/>
+          </w:rPr>
+          <w:t>ación</w:t>
         </w:r>
       </w:hyperlink>
       <w:r>
@@ -5350,6 +5514,7 @@
       <w:r>
         <w:rPr>
           <w:rStyle w:val="nfasis"/>
+          <w:noProof/>
         </w:rPr>
         <w:drawing>
           <wp:inline distT="0" distB="0" distL="0" distR="0" wp14:anchorId="6F155743" wp14:editId="1587ACD8">
@@ -5397,6 +5562,7 @@
       <w:r>
         <w:rPr>
           <w:rStyle w:val="nfasis"/>
+          <w:noProof/>
         </w:rPr>
         <w:lastRenderedPageBreak/>
         <w:drawing>
@@ -5514,6 +5680,7 @@
       </w:pPr>
       <w:r>
         <w:rPr>
+          <w:noProof/>
           <w:lang w:val="es-ES"/>
         </w:rPr>
         <w:drawing>
@@ -5602,6 +5769,7 @@
       </w:pPr>
       <w:r>
         <w:rPr>
+          <w:noProof/>
           <w:lang w:val="es-ES"/>
         </w:rPr>
         <w:drawing>
@@ -5708,17 +5876,229 @@
     </w:p>
     <w:p>
       <w:pPr>
-        <w:rPr>
-          <w:lang w:val="es-ES"/>
-        </w:rPr>
-      </w:pPr>
-    </w:p>
-    <w:p>
-      <w:pPr>
-        <w:rPr>
-          <w:lang w:val="es-ES"/>
-        </w:rPr>
-      </w:pPr>
+        <w:ind w:left="360"/>
+        <w:rPr>
+          <w:rStyle w:val="nfasis"/>
+          <w:sz w:val="24"/>
+          <w:szCs w:val="24"/>
+          <w:u w:val="single"/>
+        </w:rPr>
+      </w:pPr>
+      <w:r>
+        <w:rPr>
+          <w:rStyle w:val="nfasis"/>
+          <w:sz w:val="24"/>
+          <w:szCs w:val="24"/>
+          <w:u w:val="single"/>
+        </w:rPr>
+        <w:lastRenderedPageBreak/>
+        <w:t xml:space="preserve">Circuito </w:t>
+      </w:r>
+      <w:r>
+        <w:rPr>
+          <w:rStyle w:val="nfasis"/>
+          <w:sz w:val="24"/>
+          <w:szCs w:val="24"/>
+          <w:u w:val="single"/>
+        </w:rPr>
+        <w:t xml:space="preserve">Lógica </w:t>
+      </w:r>
+      <w:proofErr w:type="spellStart"/>
+      <w:r>
+        <w:rPr>
+          <w:rStyle w:val="nfasis"/>
+          <w:sz w:val="24"/>
+          <w:szCs w:val="24"/>
+          <w:u w:val="single"/>
+        </w:rPr>
+        <w:t>Rasp</w:t>
+      </w:r>
+      <w:proofErr w:type="spellEnd"/>
+      <w:r>
+        <w:rPr>
+          <w:rStyle w:val="nfasis"/>
+          <w:sz w:val="24"/>
+          <w:szCs w:val="24"/>
+          <w:u w:val="single"/>
+        </w:rPr>
+        <w:t>:</w:t>
+      </w:r>
+    </w:p>
+    <w:p>
+      <w:pPr>
+        <w:rPr>
+          <w:lang w:val="es-ES"/>
+        </w:rPr>
+      </w:pPr>
+    </w:p>
+    <w:p>
+      <w:pPr>
+        <w:rPr>
+          <w:lang w:val="es-ES"/>
+        </w:rPr>
+      </w:pPr>
+      <w:r>
+        <w:rPr>
+          <w:noProof/>
+        </w:rPr>
+        <w:drawing>
+          <wp:inline distT="0" distB="0" distL="0" distR="0" wp14:anchorId="7902E25C" wp14:editId="225E9E6C">
+            <wp:extent cx="5400040" cy="3035935"/>
+            <wp:effectExtent l="0" t="0" r="0" b="0"/>
+            <wp:docPr id="1800800600" name="Imagen 1"/>
+            <wp:cNvGraphicFramePr>
+              <a:graphicFrameLocks xmlns:a="http://schemas.openxmlformats.org/drawingml/2006/main" noChangeAspect="1"/>
+            </wp:cNvGraphicFramePr>
+            <a:graphic xmlns:a="http://schemas.openxmlformats.org/drawingml/2006/main">
+              <a:graphicData uri="http://schemas.openxmlformats.org/drawingml/2006/picture">
+                <pic:pic xmlns:pic="http://schemas.openxmlformats.org/drawingml/2006/picture">
+                  <pic:nvPicPr>
+                    <pic:cNvPr id="1800800600" name=""/>
+                    <pic:cNvPicPr/>
+                  </pic:nvPicPr>
+                  <pic:blipFill>
+                    <a:blip r:embed="rId53"/>
+                    <a:stretch>
+                      <a:fillRect/>
+                    </a:stretch>
+                  </pic:blipFill>
+                  <pic:spPr>
+                    <a:xfrm>
+                      <a:off x="0" y="0"/>
+                      <a:ext cx="5400040" cy="3035935"/>
+                    </a:xfrm>
+                    <a:prstGeom prst="rect">
+                      <a:avLst/>
+                    </a:prstGeom>
+                  </pic:spPr>
+                </pic:pic>
+              </a:graphicData>
+            </a:graphic>
+          </wp:inline>
+        </w:drawing>
+      </w:r>
+    </w:p>
+    <w:p>
+      <w:pPr>
+        <w:rPr>
+          <w:lang w:val="es-ES"/>
+        </w:rPr>
+      </w:pPr>
+    </w:p>
+    <w:p>
+      <w:pPr>
+        <w:rPr>
+          <w:lang w:val="es-ES"/>
+        </w:rPr>
+      </w:pPr>
+      <w:r>
+        <w:rPr>
+          <w:lang w:val="es-ES"/>
+        </w:rPr>
+        <w:t xml:space="preserve">Este es con el IRLML6344 a 0V lo que simula ser la </w:t>
+      </w:r>
+      <w:proofErr w:type="spellStart"/>
+      <w:r>
+        <w:rPr>
+          <w:lang w:val="es-ES"/>
+        </w:rPr>
+        <w:t>Rasp</w:t>
+      </w:r>
+      <w:proofErr w:type="spellEnd"/>
+      <w:r>
+        <w:rPr>
+          <w:lang w:val="es-ES"/>
+        </w:rPr>
+        <w:t>. Se ve como la corriente es mínima.</w:t>
+      </w:r>
+    </w:p>
+    <w:p>
+      <w:pPr>
+        <w:rPr>
+          <w:lang w:val="es-ES"/>
+        </w:rPr>
+      </w:pPr>
+      <w:r>
+        <w:rPr>
+          <w:noProof/>
+        </w:rPr>
+        <w:drawing>
+          <wp:inline distT="0" distB="0" distL="0" distR="0" wp14:anchorId="7F9D4185" wp14:editId="35D591DA">
+            <wp:extent cx="5400040" cy="3035935"/>
+            <wp:effectExtent l="0" t="0" r="0" b="0"/>
+            <wp:docPr id="1255464955" name="Imagen 1"/>
+            <wp:cNvGraphicFramePr>
+              <a:graphicFrameLocks xmlns:a="http://schemas.openxmlformats.org/drawingml/2006/main" noChangeAspect="1"/>
+            </wp:cNvGraphicFramePr>
+            <a:graphic xmlns:a="http://schemas.openxmlformats.org/drawingml/2006/main">
+              <a:graphicData uri="http://schemas.openxmlformats.org/drawingml/2006/picture">
+                <pic:pic xmlns:pic="http://schemas.openxmlformats.org/drawingml/2006/picture">
+                  <pic:nvPicPr>
+                    <pic:cNvPr id="1255464955" name=""/>
+                    <pic:cNvPicPr/>
+                  </pic:nvPicPr>
+                  <pic:blipFill>
+                    <a:blip r:embed="rId54"/>
+                    <a:stretch>
+                      <a:fillRect/>
+                    </a:stretch>
+                  </pic:blipFill>
+                  <pic:spPr>
+                    <a:xfrm>
+                      <a:off x="0" y="0"/>
+                      <a:ext cx="5400040" cy="3035935"/>
+                    </a:xfrm>
+                    <a:prstGeom prst="rect">
+                      <a:avLst/>
+                    </a:prstGeom>
+                  </pic:spPr>
+                </pic:pic>
+              </a:graphicData>
+            </a:graphic>
+          </wp:inline>
+        </w:drawing>
+      </w:r>
+      <w:r>
+        <w:rPr>
+          <w:lang w:val="es-ES"/>
+        </w:rPr>
+        <w:br/>
+      </w:r>
+      <w:r>
+        <w:rPr>
+          <w:lang w:val="es-ES"/>
+        </w:rPr>
+        <w:br/>
+        <w:t xml:space="preserve">Este es con la </w:t>
+      </w:r>
+      <w:proofErr w:type="spellStart"/>
+      <w:r>
+        <w:rPr>
+          <w:lang w:val="es-ES"/>
+        </w:rPr>
+        <w:t>Rasp</w:t>
+      </w:r>
+      <w:proofErr w:type="spellEnd"/>
+      <w:r>
+        <w:rPr>
+          <w:lang w:val="es-ES"/>
+        </w:rPr>
+        <w:t xml:space="preserve"> en 3.3V, se puede ver como comienza a circular corriente lo que muestra que </w:t>
+      </w:r>
+      <w:proofErr w:type="spellStart"/>
+      <w:r>
+        <w:rPr>
+          <w:lang w:val="es-ES"/>
+        </w:rPr>
+        <w:t>esta</w:t>
+      </w:r>
+      <w:proofErr w:type="spellEnd"/>
+      <w:r>
+        <w:rPr>
+          <w:lang w:val="es-ES"/>
+        </w:rPr>
+        <w:t xml:space="preserve"> cerrado el canal, esto demuestra que funciona.</w:t>
+      </w:r>
     </w:p>
     <w:p>
       <w:pPr>
@@ -8418,7 +8798,6 @@
   <w:style w:type="character" w:default="1" w:styleId="Fuentedeprrafopredeter">
     <w:name w:val="Default Paragraph Font"/>
     <w:uiPriority w:val="1"/>
-    <w:semiHidden/>
     <w:unhideWhenUsed/>
   </w:style>
   <w:style w:type="table" w:default="1" w:styleId="Tablanormal">

</xml_diff>